<commit_message>
Meeting Log 3-23-26 through 3-29-26.docx
</commit_message>
<xml_diff>
--- a/documentation/Meeting Logs/Meeting Log 3-23-26 through 3-29-26.docx
+++ b/documentation/Meeting Logs/Meeting Log 3-23-26 through 3-29-26.docx
@@ -627,6 +627,13 @@
                 <w:szCs w:val="22"/>
               </w:rPr>
             </w:pPr>
+            <w:r>
+              <w:rPr>
+                <w:sz w:val="22"/>
+                <w:szCs w:val="22"/>
+              </w:rPr>
+              <w:t>3/26/26</w:t>
+            </w:r>
           </w:p>
         </w:tc>
         <w:tc>
@@ -640,6 +647,20 @@
                 <w:szCs w:val="22"/>
               </w:rPr>
             </w:pPr>
+            <w:r>
+              <w:rPr>
+                <w:sz w:val="22"/>
+                <w:szCs w:val="22"/>
+              </w:rPr>
+              <w:t>7:00</w:t>
+            </w:r>
+            <w:r>
+              <w:rPr>
+                <w:sz w:val="22"/>
+                <w:szCs w:val="22"/>
+              </w:rPr>
+              <w:t xml:space="preserve"> P.M.</w:t>
+            </w:r>
           </w:p>
         </w:tc>
         <w:tc>
@@ -653,6 +674,13 @@
                 <w:szCs w:val="22"/>
               </w:rPr>
             </w:pPr>
+            <w:r>
+              <w:rPr>
+                <w:sz w:val="22"/>
+                <w:szCs w:val="22"/>
+              </w:rPr>
+              <w:t>Eric Parral, Kyler Cressall, Thomas Ross, Nathan Carlson</w:t>
+            </w:r>
           </w:p>
         </w:tc>
       </w:tr>
@@ -758,6 +786,42 @@
           <w:szCs w:val="22"/>
         </w:rPr>
       </w:pPr>
+      <w:r>
+        <w:rPr>
+          <w:sz w:val="22"/>
+          <w:szCs w:val="22"/>
+        </w:rPr>
+        <w:t>Meeting 2</w:t>
+      </w:r>
+      <w:r>
+        <w:rPr>
+          <w:sz w:val="22"/>
+          <w:szCs w:val="22"/>
+        </w:rPr>
+        <w:t>: We</w:t>
+      </w:r>
+      <w:r>
+        <w:rPr>
+          <w:sz w:val="22"/>
+          <w:szCs w:val="22"/>
+        </w:rPr>
+        <w:t xml:space="preserve"> divided all the tasks and worked on backlog items. </w:t>
+      </w:r>
+    </w:p>
+    <w:p>
+      <w:pPr>
+        <w:rPr>
+          <w:sz w:val="22"/>
+          <w:szCs w:val="22"/>
+        </w:rPr>
+      </w:pPr>
+      <w:r>
+        <w:rPr>
+          <w:sz w:val="22"/>
+          <w:szCs w:val="22"/>
+        </w:rPr>
+        <w:t xml:space="preserve">Meeting 3: Started our assigned items that we discussed on Wednesday. </w:t>
+      </w:r>
     </w:p>
     <w:p>
       <w:pPr>
@@ -836,6 +900,49 @@
           <w:szCs w:val="22"/>
         </w:rPr>
       </w:pPr>
+      <w:r>
+        <w:rPr>
+          <w:sz w:val="22"/>
+          <w:szCs w:val="22"/>
+        </w:rPr>
+        <w:t>Meeting 2:</w:t>
+      </w:r>
+      <w:r>
+        <w:rPr>
+          <w:sz w:val="22"/>
+          <w:szCs w:val="22"/>
+        </w:rPr>
+        <w:t xml:space="preserve"> Defining the scope for this sprint 3 as we want to make sure, we have enough time to accomplish all tasks. </w:t>
+      </w:r>
+    </w:p>
+    <w:p>
+      <w:pPr>
+        <w:rPr>
+          <w:sz w:val="22"/>
+          <w:szCs w:val="22"/>
+        </w:rPr>
+      </w:pPr>
+      <w:r>
+        <w:rPr>
+          <w:sz w:val="22"/>
+          <w:szCs w:val="22"/>
+        </w:rPr>
+        <w:t>Meeting 3:</w:t>
+      </w:r>
+      <w:r>
+        <w:rPr>
+          <w:sz w:val="22"/>
+          <w:szCs w:val="22"/>
+        </w:rPr>
+        <w:t xml:space="preserve"> Setting up times for starting the sprint 3 since it will be </w:t>
+      </w:r>
+      <w:r>
+        <w:rPr>
+          <w:sz w:val="22"/>
+          <w:szCs w:val="22"/>
+        </w:rPr>
+        <w:t xml:space="preserve">a smaller time frame. </w:t>
+      </w:r>
     </w:p>
     <w:p>
       <w:pPr>
@@ -859,6 +966,7 @@
           <w:sz w:val="22"/>
           <w:szCs w:val="22"/>
         </w:rPr>
+        <w:lastRenderedPageBreak/>
         <w:t>3. What do you plan to accomplish by the next team meeting?</w:t>
       </w:r>
       <w:r>
@@ -890,24 +998,59 @@
           <w:sz w:val="22"/>
           <w:szCs w:val="22"/>
         </w:rPr>
-        <w:t xml:space="preserve">Meeting 3: Plan and organize sprint 3 by distributing different tasks. </w:t>
-      </w:r>
-    </w:p>
-    <w:p>
-      <w:pPr>
-        <w:rPr>
-          <w:sz w:val="22"/>
-          <w:szCs w:val="22"/>
-        </w:rPr>
-      </w:pPr>
-    </w:p>
-    <w:p>
-      <w:pPr>
-        <w:rPr>
-          <w:sz w:val="22"/>
-          <w:szCs w:val="22"/>
-        </w:rPr>
-      </w:pPr>
+        <w:t xml:space="preserve">Meeting </w:t>
+      </w:r>
+      <w:r>
+        <w:rPr>
+          <w:sz w:val="22"/>
+          <w:szCs w:val="22"/>
+        </w:rPr>
+        <w:t>1</w:t>
+      </w:r>
+      <w:r>
+        <w:rPr>
+          <w:sz w:val="22"/>
+          <w:szCs w:val="22"/>
+        </w:rPr>
+        <w:t xml:space="preserve">: Plan and organize sprint 3 by distributing different tasks. </w:t>
+      </w:r>
+    </w:p>
+    <w:p>
+      <w:pPr>
+        <w:rPr>
+          <w:sz w:val="22"/>
+          <w:szCs w:val="22"/>
+        </w:rPr>
+      </w:pPr>
+      <w:r>
+        <w:rPr>
+          <w:sz w:val="22"/>
+          <w:szCs w:val="22"/>
+        </w:rPr>
+        <w:t xml:space="preserve">Meeting 2: Was discuss full extent of what tasks we want to have for this sprint </w:t>
+      </w:r>
+    </w:p>
+    <w:p>
+      <w:pPr>
+        <w:rPr>
+          <w:sz w:val="22"/>
+          <w:szCs w:val="22"/>
+        </w:rPr>
+      </w:pPr>
+      <w:r>
+        <w:rPr>
+          <w:sz w:val="22"/>
+          <w:szCs w:val="22"/>
+        </w:rPr>
+        <w:t xml:space="preserve">Meeting 3: </w:t>
+      </w:r>
+      <w:r>
+        <w:rPr>
+          <w:sz w:val="22"/>
+          <w:szCs w:val="22"/>
+        </w:rPr>
+        <w:t xml:space="preserve">Discuss what has been done over the weekend from was assigned. </w:t>
+      </w:r>
     </w:p>
     <w:p>
       <w:pPr>
@@ -967,14 +1110,57 @@
         </w:rPr>
         <w:t xml:space="preserve">Meeting 1: </w:t>
       </w:r>
-    </w:p>
-    <w:p>
-      <w:pPr>
-        <w:rPr>
-          <w:sz w:val="22"/>
-          <w:szCs w:val="22"/>
-        </w:rPr>
-      </w:pPr>
+      <w:r>
+        <w:rPr>
+          <w:sz w:val="22"/>
+          <w:szCs w:val="22"/>
+        </w:rPr>
+        <w:t>Touched base about following sprint 3 and going over what was submitted for sprint 2</w:t>
+      </w:r>
+    </w:p>
+    <w:p>
+      <w:pPr>
+        <w:rPr>
+          <w:sz w:val="22"/>
+          <w:szCs w:val="22"/>
+        </w:rPr>
+      </w:pPr>
+      <w:r>
+        <w:rPr>
+          <w:sz w:val="22"/>
+          <w:szCs w:val="22"/>
+        </w:rPr>
+        <w:t>Meeting 2:</w:t>
+      </w:r>
+      <w:r>
+        <w:rPr>
+          <w:sz w:val="22"/>
+          <w:szCs w:val="22"/>
+        </w:rPr>
+        <w:t xml:space="preserve"> The different UI items as well as how some of the backend works </w:t>
+      </w:r>
+    </w:p>
+    <w:p>
+      <w:pPr>
+        <w:rPr>
+          <w:sz w:val="22"/>
+          <w:szCs w:val="22"/>
+        </w:rPr>
+      </w:pPr>
+      <w:r>
+        <w:rPr>
+          <w:sz w:val="22"/>
+          <w:szCs w:val="22"/>
+        </w:rPr>
+        <w:t xml:space="preserve">Meeting 3: </w:t>
+      </w:r>
+      <w:r>
+        <w:rPr>
+          <w:sz w:val="22"/>
+          <w:szCs w:val="22"/>
+        </w:rPr>
+        <w:t xml:space="preserve">We are just reviewing tasks </w:t>
+      </w:r>
     </w:p>
     <w:p>
       <w:pPr>
@@ -1039,7 +1225,21 @@
           <w:sz w:val="16"/>
           <w:szCs w:val="16"/>
         </w:rPr>
-        <w:t>Since this is a small project, you may not have formal ownership roles. Instead, list the team member assigned to each action item. In larger projects, ownership and assignment are typically separate roles.</w:t>
+        <w:t xml:space="preserve">Since this is a small project, you may not have formal ownership roles. Instead, list the team </w:t>
+      </w:r>
+      <w:r>
+        <w:rPr>
+          <w:sz w:val="16"/>
+          <w:szCs w:val="16"/>
+        </w:rPr>
+        <w:t>members</w:t>
+      </w:r>
+      <w:r>
+        <w:rPr>
+          <w:sz w:val="16"/>
+          <w:szCs w:val="16"/>
+        </w:rPr>
+        <w:t xml:space="preserve"> assigned to each action item. In larger projects, ownership and assignment are typically separate roles.</w:t>
       </w:r>
     </w:p>
     <w:tbl>
@@ -1200,6 +1400,20 @@
         </w:rPr>
         <w:t xml:space="preserve"> </w:t>
       </w:r>
+      <w:r>
+        <w:rPr>
+          <w:sz w:val="22"/>
+          <w:szCs w:val="22"/>
+        </w:rPr>
+        <w:t>3/</w:t>
+      </w:r>
+      <w:r>
+        <w:rPr>
+          <w:sz w:val="22"/>
+          <w:szCs w:val="22"/>
+        </w:rPr>
+        <w:t>31/26</w:t>
+      </w:r>
     </w:p>
     <w:p>
       <w:pPr>
@@ -1226,7 +1440,14 @@
           <w:sz w:val="22"/>
           <w:szCs w:val="22"/>
         </w:rPr>
-        <w:t xml:space="preserve"> __________________________</w:t>
+        <w:t xml:space="preserve"> </w:t>
+      </w:r>
+      <w:r>
+        <w:rPr>
+          <w:sz w:val="22"/>
+          <w:szCs w:val="22"/>
+        </w:rPr>
+        <w:t>7:00</w:t>
       </w:r>
     </w:p>
     <w:p>
@@ -1281,7 +1502,21 @@
           <w:sz w:val="22"/>
           <w:szCs w:val="22"/>
         </w:rPr>
-        <w:t xml:space="preserve"> __________________________</w:t>
+        <w:t xml:space="preserve"> </w:t>
+      </w:r>
+      <w:r>
+        <w:rPr>
+          <w:sz w:val="22"/>
+          <w:szCs w:val="22"/>
+        </w:rPr>
+        <w:t>Eric Parral</w:t>
+      </w:r>
+      <w:r>
+        <w:rPr>
+          <w:sz w:val="22"/>
+          <w:szCs w:val="22"/>
+        </w:rPr>
+        <w:tab/>
       </w:r>
     </w:p>
     <w:p>
@@ -1309,7 +1544,14 @@
           <w:sz w:val="22"/>
           <w:szCs w:val="22"/>
         </w:rPr>
-        <w:t xml:space="preserve"> ____________________</w:t>
+        <w:t xml:space="preserve"> </w:t>
+      </w:r>
+      <w:r>
+        <w:rPr>
+          <w:sz w:val="22"/>
+          <w:szCs w:val="22"/>
+        </w:rPr>
+        <w:t>Eric Miguel Parral</w:t>
       </w:r>
     </w:p>
     <w:p>
@@ -1337,29 +1579,44 @@
           <w:sz w:val="22"/>
           <w:szCs w:val="22"/>
         </w:rPr>
-        <w:t xml:space="preserve"> __________________________</w:t>
-      </w:r>
-    </w:p>
-    <w:p>
-      <w:pPr>
-        <w:rPr>
-          <w:sz w:val="22"/>
-          <w:szCs w:val="22"/>
-        </w:rPr>
-      </w:pPr>
-    </w:p>
-    <w:p>
-      <w:pPr>
-        <w:rPr>
-          <w:sz w:val="22"/>
-          <w:szCs w:val="22"/>
-        </w:rPr>
-      </w:pPr>
-      <w:r>
-        <w:rPr>
-          <w:sz w:val="22"/>
-          <w:szCs w:val="22"/>
-        </w:rPr>
+        <w:t xml:space="preserve"> </w:t>
+      </w:r>
+      <w:r>
+        <w:rPr>
+          <w:sz w:val="22"/>
+          <w:szCs w:val="22"/>
+        </w:rPr>
+        <w:t>3/2</w:t>
+      </w:r>
+      <w:r>
+        <w:rPr>
+          <w:sz w:val="22"/>
+          <w:szCs w:val="22"/>
+        </w:rPr>
+        <w:t>9/26</w:t>
+      </w:r>
+    </w:p>
+    <w:p>
+      <w:pPr>
+        <w:rPr>
+          <w:sz w:val="22"/>
+          <w:szCs w:val="22"/>
+        </w:rPr>
+      </w:pPr>
+    </w:p>
+    <w:p>
+      <w:pPr>
+        <w:rPr>
+          <w:sz w:val="22"/>
+          <w:szCs w:val="22"/>
+        </w:rPr>
+      </w:pPr>
+      <w:r>
+        <w:rPr>
+          <w:sz w:val="22"/>
+          <w:szCs w:val="22"/>
+        </w:rPr>
+        <w:lastRenderedPageBreak/>
         <w:t>This meeting log supports accountability, progress tracking, and early risk identification. Logs may be reviewed periodically to assess team participation and project momentum.</w:t>
       </w:r>
     </w:p>

</xml_diff>